<commit_message>
Remove unsourced claims and working notes; renumber appendices
Co-Authored-By: Claude Sonnet 5.5 <noreply@anthropic.com>
Claude-Session: https://claude.ai/code/session_01GWS2M5dza6bPpBytmgby6V
</commit_message>
<xml_diff>
--- a/Melia-Promise-and-Proof-report-FINAL.docx
+++ b/Melia-Promise-and-Proof-report-FINAL.docx
@@ -111,7 +111,7 @@
           <w:b/>
           <w:sz w:val="24"/>
         </w:rPr>
-        <w:t>Word count (excluding title page, contents, references and appendices): 2,941</w:t>
+        <w:t>Word count (excluding title page, contents, references and appendices): 2,927</w:t>
       </w:r>
     </w:p>
     <w:p>
@@ -917,81 +917,13 @@
               <w:noProof/>
             </w:rPr>
           </w:pPr>
-          <w:hyperlink w:anchor="_Toc242368068" w:history="1">
+          <w:hyperlink w:anchor="_Toc242368070" w:history="1">
             <w:r>
               <w:rPr>
                 <w:rStyle w:val="Hyperlink"/>
                 <w:noProof/>
               </w:rPr>
-              <w:t>Appendix 3: Fact check (status as of 8 October 2026)</w:t>
-            </w:r>
-            <w:r>
-              <w:rPr>
-                <w:noProof/>
-                <w:webHidden/>
-              </w:rPr>
-              <w:tab/>
-            </w:r>
-            <w:r>
-              <w:rPr>
-                <w:noProof/>
-                <w:webHidden/>
-              </w:rPr>
-              <w:fldChar w:fldCharType="begin"/>
-            </w:r>
-            <w:r>
-              <w:rPr>
-                <w:noProof/>
-                <w:webHidden/>
-              </w:rPr>
-              <w:instrText xml:space="preserve"> PAGEREF _Toc242368068 \h </w:instrText>
-            </w:r>
-            <w:r>
-              <w:rPr>
-                <w:noProof/>
-                <w:webHidden/>
-              </w:rPr>
-            </w:r>
-            <w:r>
-              <w:rPr>
-                <w:noProof/>
-                <w:webHidden/>
-              </w:rPr>
-              <w:fldChar w:fldCharType="separate"/>
-            </w:r>
-            <w:r>
-              <w:rPr>
-                <w:noProof/>
-                <w:webHidden/>
-              </w:rPr>
-              <w:t>1</w:t>
-            </w:r>
-            <w:r>
-              <w:rPr>
-                <w:noProof/>
-                <w:webHidden/>
-              </w:rPr>
-              <w:fldChar w:fldCharType="end"/>
-            </w:r>
-          </w:hyperlink>
-        </w:p>
-        <w:p>
-          <w:pPr>
-            <w:pStyle w:val="TOC2"/>
-            <w:tabs>
-              <w:tab w:val="right" w:leader="dot" w:pos="9350"/>
-            </w:tabs>
-            <w:rPr>
-              <w:noProof/>
-            </w:rPr>
-          </w:pPr>
-          <w:hyperlink w:anchor="_Toc242368070" w:history="1">
-            <w:r>
-              <w:rPr>
-                <w:rStyle w:val="Hyperlink"/>
-                <w:noProof/>
-              </w:rPr>
-              <w:t>Appendix 4: Promise-versus-proof ledger</w:t>
+              <w:t>Appendix 3: Promise-versus-proof ledger</w:t>
             </w:r>
             <w:r>
               <w:rPr>
@@ -1059,7 +991,7 @@
                 <w:rStyle w:val="Hyperlink"/>
                 <w:noProof/>
               </w:rPr>
-              <w:t>Appendix 5: 90-day timeline (estimates)</w:t>
+              <w:t>Appendix 4: 90-day timeline (estimates)</w:t>
             </w:r>
             <w:r>
               <w:rPr>
@@ -1376,7 +1308,7 @@
       </w:r>
       <w:r>
         <w:lastRenderedPageBreak/>
-        <w:t>cannot substitute for reliability. The lens is applied to the breakfast disruption. Because the evidence is a single report, it is used to shape a protocol and not to judge past performance.</w:t>
+        <w:t>cannot substitute for reliability. The lens is applied to breakfast, the hotel’s most visible service. No failure was seen on the visit, so it is used to shape a precautionary protocol and not to judge past performance.</w:t>
       </w:r>
     </w:p>
     <w:p>
@@ -1496,11 +1428,9 @@
         <w:pStyle w:val="BodyText"/>
       </w:pPr>
       <w:r>
-        <w:t xml:space="preserve">Appendix 4 sets promise against proof. Two rows matter most. The premium promise sits against the dull lift door and dusty grille (Figs. 1 and 6), rated amber. The promise of a consistent Meliá standard at breakfast sits against a report that breakfast was moved </w:t>
-      </w:r>
-      <w:r>
-        <w:t>offsite after an electrical fault, rated red, although it rests on one report and needs corroboration. Both are small things, and at a £300 rate they are costly, because Zeithaml (1988) implies the guest paying more expects more. Using Kano’s logic, these are must-be failures, which explains why they can outweigh the delight delivered by Arado.</w:t>
-      </w:r>
+        <w:t>Appendix 3 sets promise against proof. The row that matters most sets the premium promise against the dull lift door and dusty grille (Figs. 1 and 6), rated amber. These are small things, and at a £300 rate they are costly, because Zeithaml (1988) implies the guest paying more expects more. Using Kano’s logic, these are must-be failures, which explains why they can outweigh the delight delivered by Arado.</w:t>
+      </w:r>
+      <w:r/>
     </w:p>
     <w:p>
       <w:pPr>
@@ -1535,7 +1465,7 @@
         <w:pStyle w:val="FirstParagraph"/>
       </w:pPr>
       <w:r>
-        <w:t>All costs and timings are the author’s estimates. Each recommendation is tied to evidence and a lens, and Appendix 5 gives owners, KPIs and timing.</w:t>
+        <w:t>All costs and timings are the author’s estimates. Each recommendation is tied to evidence and a lens, and Appendix 4 gives owners, KPIs and timing.</w:t>
       </w:r>
     </w:p>
     <w:p>
@@ -1565,7 +1495,7 @@
         <w:t>R2. Breakfast continuity and recovery playbook.</w:t>
       </w:r>
       <w:r>
-        <w:t xml:space="preserve"> Write an outage plan with a backup service area, a scripted apology, a standard make-good such as a drink at ’35 Bar, and a same-day manager follow-up. The offsite-breakfast report is the evidence. Smith et al. (1999) support recovery, and McCollough et al. (2000) explain why a backup plan is also needed. Measure time to first response, the share of affected guests offered a make-good, and reply time to related reviews. Estimate: low cost, about one month. The risk is that compensation becomes an expectation.</w:t>
+        <w:t xml:space="preserve"> Write an outage plan with a backup service area, a scripted apology, a standard make-good such as a drink at ’35 Bar, and a same-day manager follow-up. No failure was seen on the visit, so this is a precaution that protects the strongest touchpoint (Fig. 2). Smith et al. (1999) support recovery, and McCollough et al. (2000) explain why a backup plan is also needed. Measure time to first response, the share of affected guests offered a make-good, and reply time to related reviews. Estimate: low cost, about one month. The risk is that compensation becomes an expectation.</w:t>
       </w:r>
     </w:p>
     <w:p>
@@ -3473,7 +3403,7 @@
               <w:pStyle w:val="Compact"/>
             </w:pPr>
             <w:r>
-              <w:t>Visit observation and photos, 9 September 2025 [CONFIRM]</w:t>
+              <w:t>Visit observation and photos, 9 September 2025</w:t>
             </w:r>
           </w:p>
         </w:tc>
@@ -3797,544 +3727,6 @@
             <w:r>
               <w:lastRenderedPageBreak/>
               <w:t>claims, not facts</w:t>
-            </w:r>
-          </w:p>
-        </w:tc>
-      </w:tr>
-      <w:tr>
-        <w:tc>
-          <w:tcPr>
-            <w:tcW w:w="0" w:type="auto"/>
-          </w:tcPr>
-          <w:p>
-            <w:pPr>
-              <w:pStyle w:val="Compact"/>
-            </w:pPr>
-            <w:r>
-              <w:lastRenderedPageBreak/>
-              <w:t>Online reviews (3 platforms)</w:t>
-            </w:r>
-          </w:p>
-        </w:tc>
-        <w:tc>
-          <w:tcPr>
-            <w:tcW w:w="0" w:type="auto"/>
-          </w:tcPr>
-          <w:p>
-            <w:pPr>
-              <w:pStyle w:val="Compact"/>
-            </w:pPr>
-            <w:r>
-              <w:t>Guest voice and recurring themes</w:t>
-            </w:r>
-          </w:p>
-        </w:tc>
-        <w:tc>
-          <w:tcPr>
-            <w:tcW w:w="0" w:type="auto"/>
-          </w:tcPr>
-          <w:p>
-            <w:pPr>
-              <w:pStyle w:val="Compact"/>
-            </w:pPr>
-            <w:r>
-              <w:t>Representativeness</w:t>
-            </w:r>
-          </w:p>
-        </w:tc>
-        <w:tc>
-          <w:tcPr>
-            <w:tcW w:w="0" w:type="auto"/>
-          </w:tcPr>
-          <w:p>
-            <w:pPr>
-              <w:pStyle w:val="Compact"/>
-            </w:pPr>
-            <w:r>
-              <w:t>Indicative sample only (Litvin et al., 2008)</w:t>
-            </w:r>
-          </w:p>
-        </w:tc>
-      </w:tr>
-    </w:tbl>
-    <w:p>
-      <w:pPr>
-        <w:pStyle w:val="Heading2"/>
-      </w:pPr>
-      <w:bookmarkStart w:id="22" w:name="X1d0e27963205ec0af2f636e3873311acb947f04"/>
-      <w:bookmarkStart w:id="23" w:name="_Toc242368068"/>
-      <w:bookmarkEnd w:id="20"/>
-      <w:r>
-        <w:t>Appendix 3: Fact check (status as of 8 October 2026)</w:t>
-      </w:r>
-      <w:bookmarkEnd w:id="23"/>
-    </w:p>
-    <w:tbl>
-      <w:tblPr>
-        <w:tblStyle w:val="Table"/>
-        <w:tblW w:w="5000" w:type="pct"/>
-        <w:tblLook w:val="0020" w:firstRow="1" w:lastRow="0" w:firstColumn="0" w:lastColumn="0" w:noHBand="0" w:noVBand="0"/>
-      </w:tblPr>
-      <w:tblGrid>
-        <w:gridCol w:w="3221"/>
-        <w:gridCol w:w="2145"/>
-        <w:gridCol w:w="4210"/>
-      </w:tblGrid>
-      <w:tr>
-        <w:trPr>
-          <w:cnfStyle w:val="100000000000" w:firstRow="1" w:lastRow="0" w:firstColumn="0" w:lastColumn="0" w:oddVBand="0" w:evenVBand="0" w:oddHBand="0" w:evenHBand="0" w:firstRowFirstColumn="0" w:firstRowLastColumn="0" w:lastRowFirstColumn="0" w:lastRowLastColumn="0"/>
-          <w:tblHeader/>
-        </w:trPr>
-        <w:tc>
-          <w:tcPr>
-            <w:tcW w:w="0" w:type="auto"/>
-          </w:tcPr>
-          <w:p>
-            <w:pPr>
-              <w:pStyle w:val="Compact"/>
-            </w:pPr>
-            <w:r>
-              <w:t>Fact</w:t>
-            </w:r>
-          </w:p>
-        </w:tc>
-        <w:tc>
-          <w:tcPr>
-            <w:tcW w:w="0" w:type="auto"/>
-          </w:tcPr>
-          <w:p>
-            <w:pPr>
-              <w:pStyle w:val="Compact"/>
-            </w:pPr>
-            <w:r>
-              <w:t>Source</w:t>
-            </w:r>
-          </w:p>
-        </w:tc>
-        <w:tc>
-          <w:tcPr>
-            <w:tcW w:w="0" w:type="auto"/>
-          </w:tcPr>
-          <w:p>
-            <w:pPr>
-              <w:pStyle w:val="Compact"/>
-            </w:pPr>
-            <w:r>
-              <w:t>Status</w:t>
-            </w:r>
-          </w:p>
-        </w:tc>
-      </w:tr>
-      <w:tr>
-        <w:tc>
-          <w:tcPr>
-            <w:tcW w:w="0" w:type="auto"/>
-          </w:tcPr>
-          <w:p>
-            <w:pPr>
-              <w:pStyle w:val="Compact"/>
-            </w:pPr>
-            <w:r>
-              <w:t>£40m renovation over five years; 581 bedrooms and suites</w:t>
-            </w:r>
-          </w:p>
-        </w:tc>
-        <w:tc>
-          <w:tcPr>
-            <w:tcW w:w="0" w:type="auto"/>
-          </w:tcPr>
-          <w:p>
-            <w:pPr>
-              <w:pStyle w:val="Compact"/>
-            </w:pPr>
-            <w:r>
-              <w:t>Hospitality Net (2023) press release</w:t>
-            </w:r>
-          </w:p>
-        </w:tc>
-        <w:tc>
-          <w:tcPr>
-            <w:tcW w:w="0" w:type="auto"/>
-          </w:tcPr>
-          <w:p>
-            <w:pPr>
-              <w:pStyle w:val="Compact"/>
-            </w:pPr>
-            <w:r>
-              <w:t>Matches search summaries of the release; re-read the page before submitting</w:t>
-            </w:r>
-          </w:p>
-        </w:tc>
-      </w:tr>
-      <w:tr>
-        <w:tc>
-          <w:tcPr>
-            <w:tcW w:w="0" w:type="auto"/>
-          </w:tcPr>
-          <w:p>
-            <w:pPr>
-              <w:pStyle w:val="Compact"/>
-            </w:pPr>
-            <w:r>
-              <w:t>Completed April 2023</w:t>
-            </w:r>
-          </w:p>
-        </w:tc>
-        <w:tc>
-          <w:tcPr>
-            <w:tcW w:w="0" w:type="auto"/>
-          </w:tcPr>
-          <w:p>
-            <w:pPr>
-              <w:pStyle w:val="Compact"/>
-            </w:pPr>
-            <w:r>
-              <w:t>Business Traveller (2024)</w:t>
-            </w:r>
-          </w:p>
-        </w:tc>
-        <w:tc>
-          <w:tcPr>
-            <w:tcW w:w="0" w:type="auto"/>
-          </w:tcPr>
-          <w:p>
-            <w:pPr>
-              <w:pStyle w:val="Compact"/>
-            </w:pPr>
-            <w:r>
-              <w:t>Stated there. A 2013 release describes an earlier phase (200 of 581 rooms, from 2011) and Camden filings show works in 2025, so describe the main programme as complete</w:t>
-            </w:r>
-          </w:p>
-        </w:tc>
-      </w:tr>
-      <w:tr>
-        <w:tc>
-          <w:tcPr>
-            <w:tcW w:w="0" w:type="auto"/>
-          </w:tcPr>
-          <w:p>
-            <w:pPr>
-              <w:pStyle w:val="Compact"/>
-            </w:pPr>
-            <w:r>
-              <w:t>Co-working: ten workspaces from £40 a day; 10% off at Arado and ’35 Bar</w:t>
-            </w:r>
-          </w:p>
-        </w:tc>
-        <w:tc>
-          <w:tcPr>
-            <w:tcW w:w="0" w:type="auto"/>
-          </w:tcPr>
-          <w:p>
-            <w:pPr>
-              <w:pStyle w:val="Compact"/>
-            </w:pPr>
-            <w:r>
-              <w:t>Business Traveller (2024)</w:t>
-            </w:r>
-          </w:p>
-        </w:tc>
-        <w:tc>
-          <w:tcPr>
-            <w:tcW w:w="0" w:type="auto"/>
-          </w:tcPr>
-          <w:p>
-            <w:pPr>
-              <w:pStyle w:val="Compact"/>
-            </w:pPr>
-            <w:r>
-              <w:t>Matches search summaries; prices may have changed since April 2024</w:t>
-            </w:r>
-          </w:p>
-        </w:tc>
-      </w:tr>
-      <w:tr>
-        <w:tc>
-          <w:tcPr>
-            <w:tcW w:w="0" w:type="auto"/>
-          </w:tcPr>
-          <w:p>
-            <w:pPr>
-              <w:pStyle w:val="Compact"/>
-            </w:pPr>
-            <w:r>
-              <w:t>Grade II listed; built 1936; nine storeys, star-shaped plan</w:t>
-            </w:r>
-          </w:p>
-        </w:tc>
-        <w:tc>
-          <w:tcPr>
-            <w:tcW w:w="0" w:type="auto"/>
-          </w:tcPr>
-          <w:p>
-            <w:pPr>
-              <w:pStyle w:val="Compact"/>
-            </w:pPr>
-            <w:r>
-              <w:t>Historic England list entry 1113231</w:t>
-            </w:r>
-          </w:p>
-        </w:tc>
-        <w:tc>
-          <w:tcPr>
-            <w:tcW w:w="0" w:type="auto"/>
-          </w:tcPr>
-          <w:p>
-            <w:pPr>
-              <w:pStyle w:val="Compact"/>
-            </w:pPr>
-            <w:r>
-              <w:t>Matches search summary of the entry (listed 11 January 1999); confirm on the page</w:t>
-            </w:r>
-          </w:p>
-        </w:tc>
-      </w:tr>
-      <w:tr>
-        <w:tc>
-          <w:tcPr>
-            <w:tcW w:w="0" w:type="auto"/>
-          </w:tcPr>
-          <w:p>
-            <w:pPr>
-              <w:pStyle w:val="Compact"/>
-            </w:pPr>
-            <w:r>
-              <w:t>Room count</w:t>
-            </w:r>
-          </w:p>
-        </w:tc>
-        <w:tc>
-          <w:tcPr>
-            <w:tcW w:w="0" w:type="auto"/>
-          </w:tcPr>
-          <w:p>
-            <w:pPr>
-              <w:pStyle w:val="Compact"/>
-            </w:pPr>
-            <w:r>
-              <w:t>Hospitality Net (2023): 581; Camden Council (2025): 548</w:t>
-            </w:r>
-          </w:p>
-        </w:tc>
-        <w:tc>
-          <w:tcPr>
-            <w:tcW w:w="0" w:type="auto"/>
-          </w:tcPr>
-          <w:p>
-            <w:pPr>
-              <w:pStyle w:val="Compact"/>
-            </w:pPr>
-            <w:r>
-              <w:t>Sources conflict. Reported in Chapter 2 with both sources named</w:t>
-            </w:r>
-          </w:p>
-        </w:tc>
-      </w:tr>
-      <w:tr>
-        <w:tc>
-          <w:tcPr>
-            <w:tcW w:w="0" w:type="auto"/>
-          </w:tcPr>
-          <w:p>
-            <w:pPr>
-              <w:pStyle w:val="Compact"/>
-            </w:pPr>
-            <w:r>
-              <w:t>Meliá seventh in Brand Finance luxury ranking, Hotels 50 2026</w:t>
-            </w:r>
-          </w:p>
-        </w:tc>
-        <w:tc>
-          <w:tcPr>
-            <w:tcW w:w="0" w:type="auto"/>
-          </w:tcPr>
-          <w:p>
-            <w:pPr>
-              <w:pStyle w:val="Compact"/>
-            </w:pPr>
-            <w:r>
-              <w:t>Journal des Palaces (3 August 2026)</w:t>
-            </w:r>
-          </w:p>
-        </w:tc>
-        <w:tc>
-          <w:tcPr>
-            <w:tcW w:w="0" w:type="auto"/>
-          </w:tcPr>
-          <w:p>
-            <w:pPr>
-              <w:pStyle w:val="Compact"/>
-            </w:pPr>
-            <w:r>
-              <w:t>Matches search summary of the release</w:t>
-            </w:r>
-          </w:p>
-        </w:tc>
-      </w:tr>
-      <w:tr>
-        <w:tc>
-          <w:tcPr>
-            <w:tcW w:w="0" w:type="auto"/>
-          </w:tcPr>
-          <w:p>
-            <w:pPr>
-              <w:pStyle w:val="Compact"/>
-            </w:pPr>
-            <w:r>
-              <w:t>Meliá in S&amp;P Global Sustainability Yearbook 2026: ninth consecutive year, top 10% of sector, score 77/100</w:t>
-            </w:r>
-          </w:p>
-        </w:tc>
-        <w:tc>
-          <w:tcPr>
-            <w:tcW w:w="0" w:type="auto"/>
-          </w:tcPr>
-          <w:p>
-            <w:pPr>
-              <w:pStyle w:val="Compact"/>
-            </w:pPr>
-            <w:r>
-              <w:t>Breaking Travel News (2026)</w:t>
-            </w:r>
-          </w:p>
-        </w:tc>
-        <w:tc>
-          <w:tcPr>
-            <w:tcW w:w="0" w:type="auto"/>
-          </w:tcPr>
-          <w:p>
-            <w:pPr>
-              <w:pStyle w:val="Compact"/>
-            </w:pPr>
-            <w:r>
-              <w:t>Matches search summary; check title and date on the page</w:t>
-            </w:r>
-          </w:p>
-        </w:tc>
-      </w:tr>
-      <w:tr>
-        <w:tc>
-          <w:tcPr>
-            <w:tcW w:w="0" w:type="auto"/>
-          </w:tcPr>
-          <w:p>
-            <w:pPr>
-              <w:pStyle w:val="Compact"/>
-            </w:pPr>
-            <w:r>
-              <w:t>Rooms about £300 (staff) and about £117 (booking sites)</w:t>
-            </w:r>
-          </w:p>
-        </w:tc>
-        <w:tc>
-          <w:tcPr>
-            <w:tcW w:w="0" w:type="auto"/>
-          </w:tcPr>
-          <w:p>
-            <w:pPr>
-              <w:pStyle w:val="Compact"/>
-            </w:pPr>
-            <w:r>
-              <w:t>Staff session; booking site</w:t>
-            </w:r>
-          </w:p>
-        </w:tc>
-        <w:tc>
-          <w:tcPr>
-            <w:tcW w:w="0" w:type="auto"/>
-          </w:tcPr>
-          <w:p>
-            <w:pPr>
-              <w:pStyle w:val="Compact"/>
-            </w:pPr>
-            <w:r>
-              <w:t>NOT verified. Record the site and date of the £117 price</w:t>
-            </w:r>
-          </w:p>
-        </w:tc>
-      </w:tr>
-      <w:tr>
-        <w:tc>
-          <w:tcPr>
-            <w:tcW w:w="0" w:type="auto"/>
-          </w:tcPr>
-          <w:p>
-            <w:pPr>
-              <w:pStyle w:val="Compact"/>
-            </w:pPr>
-            <w:r>
-              <w:t>Breakfast moved offsite after an electrical fault</w:t>
-            </w:r>
-          </w:p>
-        </w:tc>
-        <w:tc>
-          <w:tcPr>
-            <w:tcW w:w="0" w:type="auto"/>
-          </w:tcPr>
-          <w:p>
-            <w:pPr>
-              <w:pStyle w:val="Compact"/>
-            </w:pPr>
-            <w:r>
-              <w:t>One review (from your notes)</w:t>
-            </w:r>
-          </w:p>
-        </w:tc>
-        <w:tc>
-          <w:tcPr>
-            <w:tcW w:w="0" w:type="auto"/>
-          </w:tcPr>
-          <w:p>
-            <w:pPr>
-              <w:pStyle w:val="Compact"/>
-            </w:pPr>
-            <w:r>
-              <w:t>NOT verified. Add platform and month, or remove R2’s evidence claim</w:t>
-            </w:r>
-          </w:p>
-        </w:tc>
-      </w:tr>
-      <w:tr>
-        <w:tc>
-          <w:tcPr>
-            <w:tcW w:w="0" w:type="auto"/>
-          </w:tcPr>
-          <w:p>
-            <w:pPr>
-              <w:pStyle w:val="Compact"/>
-            </w:pPr>
-            <w:r>
-              <w:t>Visit date 9 September 2025</w:t>
-            </w:r>
-          </w:p>
-        </w:tc>
-        <w:tc>
-          <w:tcPr>
-            <w:tcW w:w="0" w:type="auto"/>
-          </w:tcPr>
-          <w:p>
-            <w:pPr>
-              <w:pStyle w:val="Compact"/>
-            </w:pPr>
-            <w:r>
-              <w:t>Your notes</w:t>
-            </w:r>
-          </w:p>
-        </w:tc>
-        <w:tc>
-          <w:tcPr>
-            <w:tcW w:w="0" w:type="auto"/>
-          </w:tcPr>
-          <w:p>
-            <w:pPr>
-              <w:pStyle w:val="Compact"/>
-            </w:pPr>
-            <w:r>
-              <w:t xml:space="preserve">To confirm. The photo files carry a 15 September 2026 save date, not a </w:t>
-            </w:r>
-            <w:r>
-              <w:lastRenderedPageBreak/>
-              <w:t>capture date</w:t>
             </w:r>
           </w:p>
         </w:tc>
@@ -4348,11 +3740,10 @@
       <w:bookmarkStart w:id="25" w:name="_Toc242368070"/>
       <w:bookmarkEnd w:id="22"/>
       <w:r>
-        <w:lastRenderedPageBreak/>
         <w:t xml:space="preserve">Appendix </w:t>
       </w:r>
       <w:r>
-        <w:t>4</w:t>
+        <w:t>3</w:t>
       </w:r>
       <w:r>
         <w:t>: Promise-versus-proof ledger</w:t>
@@ -4587,73 +3978,6 @@
               <w:pStyle w:val="Compact"/>
             </w:pPr>
             <w:r>
-              <w:t>Consistent Meliá standard at breakfast</w:t>
-            </w:r>
-          </w:p>
-        </w:tc>
-        <w:tc>
-          <w:tcPr>
-            <w:tcW w:w="0" w:type="auto"/>
-          </w:tcPr>
-          <w:p>
-            <w:pPr>
-              <w:pStyle w:val="Compact"/>
-            </w:pPr>
-            <w:r>
-              <w:t>Breakfast moved offsite after an electrical fault (one report)</w:t>
-            </w:r>
-          </w:p>
-        </w:tc>
-        <w:tc>
-          <w:tcPr>
-            <w:tcW w:w="0" w:type="auto"/>
-          </w:tcPr>
-          <w:p>
-            <w:pPr>
-              <w:pStyle w:val="Compact"/>
-            </w:pPr>
-            <w:r>
-              <w:t>Red</w:t>
-            </w:r>
-          </w:p>
-        </w:tc>
-        <w:tc>
-          <w:tcPr>
-            <w:tcW w:w="0" w:type="auto"/>
-          </w:tcPr>
-          <w:p>
-            <w:pPr>
-              <w:pStyle w:val="Compact"/>
-            </w:pPr>
-            <w:r>
-              <w:t>Functional (recovery)</w:t>
-            </w:r>
-          </w:p>
-        </w:tc>
-        <w:tc>
-          <w:tcPr>
-            <w:tcW w:w="0" w:type="auto"/>
-          </w:tcPr>
-          <w:p>
-            <w:pPr>
-              <w:pStyle w:val="Compact"/>
-            </w:pPr>
-            <w:r>
-              <w:t>Review [ADD]</w:t>
-            </w:r>
-          </w:p>
-        </w:tc>
-      </w:tr>
-      <w:tr>
-        <w:tc>
-          <w:tcPr>
-            <w:tcW w:w="0" w:type="auto"/>
-          </w:tcPr>
-          <w:p>
-            <w:pPr>
-              <w:pStyle w:val="Compact"/>
-            </w:pPr>
-            <w:r>
               <w:t>Heritage as an asset</w:t>
             </w:r>
           </w:p>
@@ -4857,7 +4181,7 @@
         <w:t xml:space="preserve">Appendix </w:t>
       </w:r>
       <w:r>
-        <w:t>5</w:t>
+        <w:t>4</w:t>
       </w:r>
       <w:r>
         <w:t>: 90-day timeline (estimates)</w:t>

</xml_diff>

<commit_message>
Remove unsupported booking-site price
Co-Authored-By: Claude Sonnet 5.5 <noreply@anthropic.com>
Claude-Session: https://claude.ai/code/session_01GWS2M5dza6bPpBytmgby6V
</commit_message>
<xml_diff>
--- a/Melia-Promise-and-Proof-report-FINAL.docx
+++ b/Melia-Promise-and-Proof-report-FINAL.docx
@@ -111,7 +111,7 @@
           <w:b/>
           <w:sz w:val="24"/>
         </w:rPr>
-        <w:t>Word count (excluding title page, contents, references and appendices): 2,927</w:t>
+        <w:t>Word count (excluding title page, contents, references and appendices): 2,930</w:t>
       </w:r>
     </w:p>
     <w:p>
@@ -1131,7 +1131,7 @@
         <w:pStyle w:val="FirstParagraph"/>
       </w:pPr>
       <w:r>
-        <w:t>The argument is that the hotel delivers its premium promise where guests look first (public spaces, breakfast, bar) and under-delivers where they look closely (condition and consistency). That gap matters more at a quoted rate near £300 than at about £117. Chapter 2 sets out the method, Chapters 3 and 4 the tools and the decisions, Chapter 5 the evidence, and Chapters 6 and 7 the recommendations and conclusion.</w:t>
+        <w:t>The argument is that the hotel delivers its premium promise where guests look first (public spaces, breakfast, bar) and under-delivers where they look closely (condition and consistency). That gap matters more at a quoted rate near £300 than it would at a budget rate. Chapter 2 sets out the method, Chapters 3 and 4 the tools and the decisions, Chapter 5 the evidence, and Chapters 6 and 7 the recommendations and conclusion.</w:t>
       </w:r>
     </w:p>
     <w:p>
@@ -1274,7 +1274,7 @@
         <w:t>Value and fairness.</w:t>
       </w:r>
       <w:r>
-        <w:t xml:space="preserve"> Zeithaml (1988) places value in the guest’s head, so it differs between guests. Xia, Monroe and Cox (2004) add that price differences are judged for fairness, and Kimes (2002) notes that yield pricing is rational for the hotel yet can feel unfair. Rooms quoted at about £300 on the visit and about £117 on booking sites create guests with very different yardsticks. The same lift door can be forgiven at one price and resented at the other.</w:t>
+        <w:t xml:space="preserve"> Zeithaml (1988) places value in the guest’s head, so it differs between guests. Xia, Monroe and Cox (2004) add that price differences are judged for fairness, and Kimes (2002) notes that yield pricing is rational for the hotel yet can feel unfair. Rooms quoted at about £300 on the visit, a level online listings also suggest, set a high yardstick. The same lift door can be forgiven at a budget price and resented at a premium one.</w:t>
       </w:r>
     </w:p>
     <w:p>
@@ -1392,7 +1392,7 @@
         <w:t>Decision 4: the premium badge.</w:t>
       </w:r>
       <w:r>
-        <w:t xml:space="preserve"> Brand Finance’s Hotels 50 2026 ranking places Meliá seventh among luxury hotel brands, the only Spanish company in the top ten strongest luxury brands (Journal des Palaces, 2026). S&amp;P Global’s Sustainability Yearbook 2026 includes Meliá for the ninth consecutive year, in the top 10% of its sector with a score of 77 out of 100 (Breaking Travel News, 2026). These are ranking and corporate claims, not audits, and they describe the group, not this property. Zeithaml (1988) and Xia et al. (2004) suggest a premium badge raises the standard against which every detail is judged, particularly at £300 rather than £117. Manaktola and Jauhari (2007) find that guests’ green attitudes do not always translate into choices, so sustainability should be supporting value, not the lead. The only sustainability cue seen on the visit was the organic cava (Fig. 3). A brand that wanted guests to credit its green record would need visible, repeated cues, and one organic product offers little. The verdict is that the badge is a promise the hotel must now prove room by room, and the group claims say little about this property.</w:t>
+        <w:t xml:space="preserve"> Brand Finance’s Hotels 50 2026 ranking places Meliá seventh among luxury hotel brands, the only Spanish company in the top ten strongest luxury brands (Journal des Palaces, 2026). S&amp;P Global’s Sustainability Yearbook 2026 includes Meliá for the ninth consecutive year, in the top 10% of its sector with a score of 77 out of 100 (Breaking Travel News, 2026). These are ranking and corporate claims, not audits, and they describe the group, not this property. Zeithaml (1988) and Xia et al. (2004) suggest a premium badge raises the standard against which every detail is judged, particularly at a rate near £300. Manaktola and Jauhari (2007) find that guests’ green attitudes do not always translate into choices, so sustainability should be supporting value, not the lead. The only sustainability cue seen on the visit was the organic cava (Fig. 3). A brand that wanted guests to credit its green record would need visible, repeated cues, and one organic product offers little. The verdict is that the badge is a promise the hotel must now prove room by room, and the group claims say little about this property.</w:t>
       </w:r>
     </w:p>
     <w:p>
@@ -1554,7 +1554,7 @@
         <w:pStyle w:val="FirstParagraph"/>
       </w:pPr>
       <w:r>
-        <w:t>Meliá White House largely delivers its premium promise where guests look first, in public spaces, breakfast and the bar, but under-delivers on condition and consistency, which matters more at £300 than at £117. These findings rest on one hosted visit, photographic and document evidence and a small number of self-selected guest reviews. The hotel should first fix breakfast continuity and its must-be basics, because they are cheap, fast and protect the investment already made.</w:t>
+        <w:t>Meliá White House largely delivers its premium promise where guests look first, in public spaces, breakfast and the bar, but under-delivers on condition and consistency, which matters more at a rate near £300. These findings rest on one hosted visit, photographic and document evidence and a small number of self-selected guest reviews. The hotel should first fix breakfast continuity and its must-be basics, because they are cheap, fast and protect the investment already made.</w:t>
       </w:r>
     </w:p>
     <w:p>

</xml_diff>

<commit_message>
Soften three over-stated literature claims
Co-Authored-By: Claude Sonnet 5.5 <noreply@anthropic.com>
Claude-Session: https://claude.ai/code/session_01GWS2M5dza6bPpBytmgby6V
</commit_message>
<xml_diff>
--- a/Melia-Promise-and-Proof-report-FINAL.docx
+++ b/Melia-Promise-and-Proof-report-FINAL.docx
@@ -111,7 +111,7 @@
           <w:b/>
           <w:sz w:val="24"/>
         </w:rPr>
-        <w:t>Word count (excluding title page, contents, references and appendices): 2,930</w:t>
+        <w:t>Word count (excluding title page, contents, references and appendices): 2,943</w:t>
       </w:r>
     </w:p>
     <w:p>
@@ -1343,7 +1343,7 @@
         <w:t>Decision 1: the big bet.</w:t>
       </w:r>
       <w:r>
-        <w:t xml:space="preserve"> Meliá reports £40m invested over five years while the hotel stayed open (Hospitality Net, 2023). Grant (1991) would treat a Grade II listed building as a scarce resource that rivals cannot copy. Eisenhardt and Martin (2000) frame renovating while trading as a capability, because revenue and learning continue. The corridors and gym show the heritage carried through: cornice detail runs through the fitness area (Fig. 6) and the lift lobby pairs black marble with a pedimented surround (Fig. 1). Yet Poria et al. (2003) question whether guests value heritage at all, and the same two photographs show how quickly it turns into a liability when not maintained. The lift door has a dull, uneven finish, and the air-conditioning grille above the cornice is visibly dusty. Camden filings also show works continuing in 2025, including a Wing A refurbishment and a basement conversion (Camden Council, 2025). The verdict is that the asset justified the bet, but trading through works moved some cost onto guests, and a £40m spend only protects value if standards are then sustained. The renovation creates an obligation to maintain, not merely to reach a standard once.</w:t>
+        <w:t xml:space="preserve"> Meliá reports £40m invested over five years while the hotel stayed open (Hospitality Net, 2023). Grant (1991) would treat a Grade II listed building as a scarce resource that rivals cannot copy. Eisenhardt and Martin (2000) suggest renovating while trading can be read as a capability, because revenue and learning continue. The corridors and gym show the heritage carried through: cornice detail runs through the fitness area (Fig. 6) and the lift lobby pairs black marble with a pedimented surround (Fig. 1). Yet Poria et al. (2003) suggest heritage appeals through a personal link with the past, which a neglected finish does not support, and the same two photographs show how quickly it turns into a liability when not maintained. The lift door has a dull, uneven finish, and the air-conditioning grille above the cornice is visibly dusty. Camden filings also show works continuing in 2025, including a Wing A refurbishment and a basement conversion (Camden Council, 2025). The verdict is that the asset justified the bet, but trading through works moved some cost onto guests, and a £40m spend only protects value if standards are then sustained. The renovation creates an obligation to maintain, not merely to reach a standard once.</w:t>
       </w:r>
     </w:p>
     <w:p>
@@ -1437,7 +1437,7 @@
         <w:pStyle w:val="BodyText"/>
       </w:pPr>
       <w:r>
-        <w:t>Zomerdijk and Voss (2010) treat the journey as a chain of touchpoints, and the weakest one shapes the memory, so one dull lift door can outweigh an excellent breakfast. Schneider and Bowen (1993) link staff experience to guest satisfaction, but the causality is weakly supported, so staff are noted as context only.</w:t>
+        <w:t>Zomerdijk and Voss (2010) treat the journey as a chain of touchpoints, so a weak one can stand out, and one dull lift door may outweigh an excellent breakfast. Schneider and Bowen (1993) link staff experience to guest satisfaction, but the causality is weakly supported, so staff are noted as context only.</w:t>
       </w:r>
     </w:p>
     <w:p>

</xml_diff>